<commit_message>
Simplify code, remove comments from experiment submission
Co-Authored-By: Claude Sonnet 5.5 <noreply@anthropic.com>
Claude-Session: https://claude.ai/code/session_019xe3RvJLr44vVSxyK66BKy
</commit_message>
<xml_diff>
--- a/AI_Experiment_10_Monkey_Banana_Krishang_B106.docx
+++ b/AI_Experiment_10_Monkey_Banana_Krishang_B106.docx
@@ -861,54 +861,6 @@
           <w:rFonts w:ascii="Courier New" w:hAnsi="Courier New"/>
           <w:sz w:val="17"/>
         </w:rPr>
-        <w:t>"""</w:t>
-        <w:br/>
-      </w:r>
-      <w:r>
-        <w:rPr>
-          <w:rFonts w:ascii="Courier New" w:hAnsi="Courier New"/>
-          <w:sz w:val="17"/>
-        </w:rPr>
-        <w:t>AI Experiment 10 - Monkey Banana Problem (BFS state-space search)</w:t>
-        <w:br/>
-      </w:r>
-      <w:r>
-        <w:rPr>
-          <w:rFonts w:ascii="Courier New" w:hAnsi="Courier New"/>
-          <w:sz w:val="17"/>
-        </w:rPr>
-        <w:t>Name  : Krishang Vikram Singh      Roll No. : B106</w:t>
-        <w:br/>
-      </w:r>
-      <w:r>
-        <w:rPr>
-          <w:rFonts w:ascii="Courier New" w:hAnsi="Courier New"/>
-          <w:sz w:val="17"/>
-        </w:rPr>
-        <w:t>Batch : C1                         Class    : B.Tech CE</w:t>
-        <w:br/>
-      </w:r>
-      <w:r>
-        <w:rPr>
-          <w:rFonts w:ascii="Courier New" w:hAnsi="Courier New"/>
-          <w:sz w:val="17"/>
-        </w:rPr>
-        <w:t>Date of Experiment &amp; Submission : 15/10/24</w:t>
-        <w:br/>
-      </w:r>
-      <w:r>
-        <w:rPr>
-          <w:rFonts w:ascii="Courier New" w:hAnsi="Courier New"/>
-          <w:sz w:val="17"/>
-        </w:rPr>
-        <w:t>"""</w:t>
-        <w:br/>
-      </w:r>
-      <w:r>
-        <w:rPr>
-          <w:rFonts w:ascii="Courier New" w:hAnsi="Courier New"/>
-          <w:sz w:val="17"/>
-        </w:rPr>
         <w:t>from collections import deque</w:t>
         <w:br/>
       </w:r>
@@ -924,122 +876,77 @@
           <w:rFonts w:ascii="Courier New" w:hAnsi="Courier New"/>
           <w:sz w:val="17"/>
         </w:rPr>
-        <w:t>POSITIONS = ("door", "window", "middle")   # locations in the room</w:t>
-        <w:br/>
-      </w:r>
-      <w:r>
-        <w:rPr>
-          <w:rFonts w:ascii="Courier New" w:hAnsi="Courier New"/>
-          <w:sz w:val="17"/>
-        </w:rPr>
-        <w:t>BANANA_POS = "middle"                      # bananas hang above the middle</w:t>
-        <w:br/>
-      </w:r>
-      <w:r>
-        <w:rPr>
-          <w:rFonts w:ascii="Courier New" w:hAnsi="Courier New"/>
-          <w:sz w:val="17"/>
-        </w:rPr>
-        <w:br/>
-      </w:r>
-      <w:r>
-        <w:rPr>
-          <w:rFonts w:ascii="Courier New" w:hAnsi="Courier New"/>
-          <w:sz w:val="17"/>
-        </w:rPr>
-        <w:t># State = (monkey_pos, monkey_on_box, box_pos, has_banana)</w:t>
-        <w:br/>
-      </w:r>
-      <w:r>
-        <w:rPr>
-          <w:rFonts w:ascii="Courier New" w:hAnsi="Courier New"/>
-          <w:sz w:val="17"/>
-        </w:rPr>
-        <w:t>START = ("door", False, "window", False)</w:t>
-        <w:br/>
-      </w:r>
-      <w:r>
-        <w:rPr>
-          <w:rFonts w:ascii="Courier New" w:hAnsi="Courier New"/>
-          <w:sz w:val="17"/>
-        </w:rPr>
-        <w:br/>
-      </w:r>
-      <w:r>
-        <w:rPr>
-          <w:rFonts w:ascii="Courier New" w:hAnsi="Courier New"/>
-          <w:sz w:val="17"/>
-        </w:rPr>
-        <w:br/>
-      </w:r>
-      <w:r>
-        <w:rPr>
-          <w:rFonts w:ascii="Courier New" w:hAnsi="Courier New"/>
-          <w:sz w:val="17"/>
-        </w:rPr>
-        <w:t>def is_goal(s):</w:t>
-        <w:br/>
-      </w:r>
-      <w:r>
-        <w:rPr>
-          <w:rFonts w:ascii="Courier New" w:hAnsi="Courier New"/>
-          <w:sz w:val="17"/>
-        </w:rPr>
-        <w:t xml:space="preserve">    return s[3]</w:t>
-        <w:br/>
-      </w:r>
-      <w:r>
-        <w:rPr>
-          <w:rFonts w:ascii="Courier New" w:hAnsi="Courier New"/>
-          <w:sz w:val="17"/>
-        </w:rPr>
-        <w:br/>
-      </w:r>
-      <w:r>
-        <w:rPr>
-          <w:rFonts w:ascii="Courier New" w:hAnsi="Courier New"/>
-          <w:sz w:val="17"/>
-        </w:rPr>
-        <w:br/>
-      </w:r>
-      <w:r>
-        <w:rPr>
-          <w:rFonts w:ascii="Courier New" w:hAnsi="Courier New"/>
-          <w:sz w:val="17"/>
-        </w:rPr>
-        <w:t>def successors(s):</w:t>
-        <w:br/>
-      </w:r>
-      <w:r>
-        <w:rPr>
-          <w:rFonts w:ascii="Courier New" w:hAnsi="Courier New"/>
-          <w:sz w:val="17"/>
-        </w:rPr>
-        <w:t xml:space="preserve">    """Yield (action description, new_state) for every legal action."""</w:t>
-        <w:br/>
-      </w:r>
-      <w:r>
-        <w:rPr>
-          <w:rFonts w:ascii="Courier New" w:hAnsi="Courier New"/>
-          <w:sz w:val="17"/>
-        </w:rPr>
-        <w:t xml:space="preserve">    m, on_box, b, has = s</w:t>
-        <w:br/>
-      </w:r>
-      <w:r>
-        <w:rPr>
-          <w:rFonts w:ascii="Courier New" w:hAnsi="Courier New"/>
-          <w:sz w:val="17"/>
-        </w:rPr>
-        <w:t xml:space="preserve">    if has:</w:t>
-        <w:br/>
-      </w:r>
-      <w:r>
-        <w:rPr>
-          <w:rFonts w:ascii="Courier New" w:hAnsi="Courier New"/>
-          <w:sz w:val="17"/>
-        </w:rPr>
-        <w:t xml:space="preserve">        return</w:t>
+        <w:t>places = ["door", "window", "middle"]</w:t>
+        <w:br/>
+      </w:r>
+      <w:r>
+        <w:rPr>
+          <w:rFonts w:ascii="Courier New" w:hAnsi="Courier New"/>
+          <w:sz w:val="17"/>
+        </w:rPr>
+        <w:t>banana_at = "middle"</w:t>
+        <w:br/>
+      </w:r>
+      <w:r>
+        <w:rPr>
+          <w:rFonts w:ascii="Courier New" w:hAnsi="Courier New"/>
+          <w:sz w:val="17"/>
+        </w:rPr>
+        <w:t>start = ("door", False, "window", False)</w:t>
+        <w:br/>
+      </w:r>
+      <w:r>
+        <w:rPr>
+          <w:rFonts w:ascii="Courier New" w:hAnsi="Courier New"/>
+          <w:sz w:val="17"/>
+        </w:rPr>
+        <w:br/>
+      </w:r>
+      <w:r>
+        <w:rPr>
+          <w:rFonts w:ascii="Courier New" w:hAnsi="Courier New"/>
+          <w:sz w:val="17"/>
+        </w:rPr>
+        <w:br/>
+      </w:r>
+      <w:r>
+        <w:rPr>
+          <w:rFonts w:ascii="Courier New" w:hAnsi="Courier New"/>
+          <w:sz w:val="17"/>
+        </w:rPr>
+        <w:t>def next_states(state):</w:t>
+        <w:br/>
+      </w:r>
+      <w:r>
+        <w:rPr>
+          <w:rFonts w:ascii="Courier New" w:hAnsi="Courier New"/>
+          <w:sz w:val="17"/>
+        </w:rPr>
+        <w:t xml:space="preserve">    monkey, on_box, box, has_banana = state</w:t>
+        <w:br/>
+      </w:r>
+      <w:r>
+        <w:rPr>
+          <w:rFonts w:ascii="Courier New" w:hAnsi="Courier New"/>
+          <w:sz w:val="17"/>
+        </w:rPr>
+        <w:t xml:space="preserve">    result = []</w:t>
+        <w:br/>
+      </w:r>
+      <w:r>
+        <w:rPr>
+          <w:rFonts w:ascii="Courier New" w:hAnsi="Courier New"/>
+          <w:sz w:val="17"/>
+        </w:rPr>
+        <w:t xml:space="preserve">    if has_banana:</w:t>
+        <w:br/>
+      </w:r>
+      <w:r>
+        <w:rPr>
+          <w:rFonts w:ascii="Courier New" w:hAnsi="Courier New"/>
+          <w:sz w:val="17"/>
+        </w:rPr>
+        <w:t xml:space="preserve">        return result</w:t>
         <w:br/>
       </w:r>
       <w:r>
@@ -1055,63 +962,63 @@
           <w:rFonts w:ascii="Courier New" w:hAnsi="Courier New"/>
           <w:sz w:val="17"/>
         </w:rPr>
-        <w:t xml:space="preserve">        for p in POSITIONS:                       # walk</w:t>
-        <w:br/>
-      </w:r>
-      <w:r>
-        <w:rPr>
-          <w:rFonts w:ascii="Courier New" w:hAnsi="Courier New"/>
-          <w:sz w:val="17"/>
-        </w:rPr>
-        <w:t xml:space="preserve">            if p != m:</w:t>
-        <w:br/>
-      </w:r>
-      <w:r>
-        <w:rPr>
-          <w:rFonts w:ascii="Courier New" w:hAnsi="Courier New"/>
-          <w:sz w:val="17"/>
-        </w:rPr>
-        <w:t xml:space="preserve">                yield f"Walk from {m} to {p}", (p, False, b, has)</w:t>
-        <w:br/>
-      </w:r>
-      <w:r>
-        <w:rPr>
-          <w:rFonts w:ascii="Courier New" w:hAnsi="Courier New"/>
-          <w:sz w:val="17"/>
-        </w:rPr>
-        <w:t xml:space="preserve">        if m == b:</w:t>
-        <w:br/>
-      </w:r>
-      <w:r>
-        <w:rPr>
-          <w:rFonts w:ascii="Courier New" w:hAnsi="Courier New"/>
-          <w:sz w:val="17"/>
-        </w:rPr>
-        <w:t xml:space="preserve">            for p in POSITIONS:                   # push box (monkey moves with it)</w:t>
-        <w:br/>
-      </w:r>
-      <w:r>
-        <w:rPr>
-          <w:rFonts w:ascii="Courier New" w:hAnsi="Courier New"/>
-          <w:sz w:val="17"/>
-        </w:rPr>
-        <w:t xml:space="preserve">                if p != b:</w:t>
-        <w:br/>
-      </w:r>
-      <w:r>
-        <w:rPr>
-          <w:rFonts w:ascii="Courier New" w:hAnsi="Courier New"/>
-          <w:sz w:val="17"/>
-        </w:rPr>
-        <w:t xml:space="preserve">                    yield f"Push box from {b} to {p}", (p, False, p, has)</w:t>
-        <w:br/>
-      </w:r>
-      <w:r>
-        <w:rPr>
-          <w:rFonts w:ascii="Courier New" w:hAnsi="Courier New"/>
-          <w:sz w:val="17"/>
-        </w:rPr>
-        <w:t xml:space="preserve">            yield "Climb onto the box", (m, True, b, has)</w:t>
+        <w:t xml:space="preserve">        for p in places:</w:t>
+        <w:br/>
+      </w:r>
+      <w:r>
+        <w:rPr>
+          <w:rFonts w:ascii="Courier New" w:hAnsi="Courier New"/>
+          <w:sz w:val="17"/>
+        </w:rPr>
+        <w:t xml:space="preserve">            if p != monkey:</w:t>
+        <w:br/>
+      </w:r>
+      <w:r>
+        <w:rPr>
+          <w:rFonts w:ascii="Courier New" w:hAnsi="Courier New"/>
+          <w:sz w:val="17"/>
+        </w:rPr>
+        <w:t xml:space="preserve">                result.append(("Walk to " + p, (p, False, box, False)))</w:t>
+        <w:br/>
+      </w:r>
+      <w:r>
+        <w:rPr>
+          <w:rFonts w:ascii="Courier New" w:hAnsi="Courier New"/>
+          <w:sz w:val="17"/>
+        </w:rPr>
+        <w:t xml:space="preserve">        if monkey == box:</w:t>
+        <w:br/>
+      </w:r>
+      <w:r>
+        <w:rPr>
+          <w:rFonts w:ascii="Courier New" w:hAnsi="Courier New"/>
+          <w:sz w:val="17"/>
+        </w:rPr>
+        <w:t xml:space="preserve">            for p in places:</w:t>
+        <w:br/>
+      </w:r>
+      <w:r>
+        <w:rPr>
+          <w:rFonts w:ascii="Courier New" w:hAnsi="Courier New"/>
+          <w:sz w:val="17"/>
+        </w:rPr>
+        <w:t xml:space="preserve">                if p != box:</w:t>
+        <w:br/>
+      </w:r>
+      <w:r>
+        <w:rPr>
+          <w:rFonts w:ascii="Courier New" w:hAnsi="Courier New"/>
+          <w:sz w:val="17"/>
+        </w:rPr>
+        <w:t xml:space="preserve">                    result.append(("Push box to " + p, (p, False, p, False)))</w:t>
+        <w:br/>
+      </w:r>
+      <w:r>
+        <w:rPr>
+          <w:rFonts w:ascii="Courier New" w:hAnsi="Courier New"/>
+          <w:sz w:val="17"/>
+        </w:rPr>
+        <w:t xml:space="preserve">            result.append(("Climb on box", (monkey, True, box, False)))</w:t>
         <w:br/>
       </w:r>
       <w:r>
@@ -1127,133 +1034,133 @@
           <w:rFonts w:ascii="Courier New" w:hAnsi="Courier New"/>
           <w:sz w:val="17"/>
         </w:rPr>
-        <w:t xml:space="preserve">        yield "Climb down from the box", (m, False, b, has)</w:t>
-        <w:br/>
-      </w:r>
-      <w:r>
-        <w:rPr>
-          <w:rFonts w:ascii="Courier New" w:hAnsi="Courier New"/>
-          <w:sz w:val="17"/>
-        </w:rPr>
-        <w:t xml:space="preserve">        if m == BANANA_POS:</w:t>
-        <w:br/>
-      </w:r>
-      <w:r>
-        <w:rPr>
-          <w:rFonts w:ascii="Courier New" w:hAnsi="Courier New"/>
-          <w:sz w:val="17"/>
-        </w:rPr>
-        <w:t xml:space="preserve">            yield "Grasp the banana", (m, True, b, True)</w:t>
-        <w:br/>
-      </w:r>
-      <w:r>
-        <w:rPr>
-          <w:rFonts w:ascii="Courier New" w:hAnsi="Courier New"/>
-          <w:sz w:val="17"/>
-        </w:rPr>
-        <w:br/>
-      </w:r>
-      <w:r>
-        <w:rPr>
-          <w:rFonts w:ascii="Courier New" w:hAnsi="Courier New"/>
-          <w:sz w:val="17"/>
-        </w:rPr>
-        <w:br/>
-      </w:r>
-      <w:r>
-        <w:rPr>
-          <w:rFonts w:ascii="Courier New" w:hAnsi="Courier New"/>
-          <w:sz w:val="17"/>
-        </w:rPr>
-        <w:t>def solve(start=START):</w:t>
-        <w:br/>
-      </w:r>
-      <w:r>
-        <w:rPr>
-          <w:rFonts w:ascii="Courier New" w:hAnsi="Courier New"/>
-          <w:sz w:val="17"/>
-        </w:rPr>
-        <w:t xml:space="preserve">    """Breadth-first search -&gt; shortest sequence of actions."""</w:t>
-        <w:br/>
-      </w:r>
-      <w:r>
-        <w:rPr>
-          <w:rFonts w:ascii="Courier New" w:hAnsi="Courier New"/>
-          <w:sz w:val="17"/>
-        </w:rPr>
-        <w:t xml:space="preserve">    q = deque([(start, [])])</w:t>
-        <w:br/>
-      </w:r>
-      <w:r>
-        <w:rPr>
-          <w:rFonts w:ascii="Courier New" w:hAnsi="Courier New"/>
-          <w:sz w:val="17"/>
-        </w:rPr>
-        <w:t xml:space="preserve">    seen = {start}</w:t>
-        <w:br/>
-      </w:r>
-      <w:r>
-        <w:rPr>
-          <w:rFonts w:ascii="Courier New" w:hAnsi="Courier New"/>
-          <w:sz w:val="17"/>
-        </w:rPr>
-        <w:t xml:space="preserve">    while q:</w:t>
-        <w:br/>
-      </w:r>
-      <w:r>
-        <w:rPr>
-          <w:rFonts w:ascii="Courier New" w:hAnsi="Courier New"/>
-          <w:sz w:val="17"/>
-        </w:rPr>
-        <w:t xml:space="preserve">        state, path = q.popleft()</w:t>
-        <w:br/>
-      </w:r>
-      <w:r>
-        <w:rPr>
-          <w:rFonts w:ascii="Courier New" w:hAnsi="Courier New"/>
-          <w:sz w:val="17"/>
-        </w:rPr>
-        <w:t xml:space="preserve">        if is_goal(state):</w:t>
-        <w:br/>
-      </w:r>
-      <w:r>
-        <w:rPr>
-          <w:rFonts w:ascii="Courier New" w:hAnsi="Courier New"/>
-          <w:sz w:val="17"/>
-        </w:rPr>
-        <w:t xml:space="preserve">            return path</w:t>
-        <w:br/>
-      </w:r>
-      <w:r>
-        <w:rPr>
-          <w:rFonts w:ascii="Courier New" w:hAnsi="Courier New"/>
-          <w:sz w:val="17"/>
-        </w:rPr>
-        <w:t xml:space="preserve">        for act, nxt in successors(state):</w:t>
-        <w:br/>
-      </w:r>
-      <w:r>
-        <w:rPr>
-          <w:rFonts w:ascii="Courier New" w:hAnsi="Courier New"/>
-          <w:sz w:val="17"/>
-        </w:rPr>
-        <w:t xml:space="preserve">            if nxt not in seen:</w:t>
-        <w:br/>
-      </w:r>
-      <w:r>
-        <w:rPr>
-          <w:rFonts w:ascii="Courier New" w:hAnsi="Courier New"/>
-          <w:sz w:val="17"/>
-        </w:rPr>
-        <w:t xml:space="preserve">                seen.add(nxt)</w:t>
-        <w:br/>
-      </w:r>
-      <w:r>
-        <w:rPr>
-          <w:rFonts w:ascii="Courier New" w:hAnsi="Courier New"/>
-          <w:sz w:val="17"/>
-        </w:rPr>
-        <w:t xml:space="preserve">                q.append((nxt, path + [(act, nxt)]))</w:t>
+        <w:t xml:space="preserve">        result.append(("Climb down", (monkey, False, box, False)))</w:t>
+        <w:br/>
+      </w:r>
+      <w:r>
+        <w:rPr>
+          <w:rFonts w:ascii="Courier New" w:hAnsi="Courier New"/>
+          <w:sz w:val="17"/>
+        </w:rPr>
+        <w:t xml:space="preserve">        if monkey == banana_at:</w:t>
+        <w:br/>
+      </w:r>
+      <w:r>
+        <w:rPr>
+          <w:rFonts w:ascii="Courier New" w:hAnsi="Courier New"/>
+          <w:sz w:val="17"/>
+        </w:rPr>
+        <w:t xml:space="preserve">            result.append(("Grab banana", (monkey, True, box, True)))</w:t>
+        <w:br/>
+      </w:r>
+      <w:r>
+        <w:rPr>
+          <w:rFonts w:ascii="Courier New" w:hAnsi="Courier New"/>
+          <w:sz w:val="17"/>
+        </w:rPr>
+        <w:t xml:space="preserve">    return result</w:t>
+        <w:br/>
+      </w:r>
+      <w:r>
+        <w:rPr>
+          <w:rFonts w:ascii="Courier New" w:hAnsi="Courier New"/>
+          <w:sz w:val="17"/>
+        </w:rPr>
+        <w:br/>
+      </w:r>
+      <w:r>
+        <w:rPr>
+          <w:rFonts w:ascii="Courier New" w:hAnsi="Courier New"/>
+          <w:sz w:val="17"/>
+        </w:rPr>
+        <w:br/>
+      </w:r>
+      <w:r>
+        <w:rPr>
+          <w:rFonts w:ascii="Courier New" w:hAnsi="Courier New"/>
+          <w:sz w:val="17"/>
+        </w:rPr>
+        <w:t>def solve():</w:t>
+        <w:br/>
+      </w:r>
+      <w:r>
+        <w:rPr>
+          <w:rFonts w:ascii="Courier New" w:hAnsi="Courier New"/>
+          <w:sz w:val="17"/>
+        </w:rPr>
+        <w:t xml:space="preserve">    queue = deque([(start, [])])</w:t>
+        <w:br/>
+      </w:r>
+      <w:r>
+        <w:rPr>
+          <w:rFonts w:ascii="Courier New" w:hAnsi="Courier New"/>
+          <w:sz w:val="17"/>
+        </w:rPr>
+        <w:t xml:space="preserve">    visited = {start}</w:t>
+        <w:br/>
+      </w:r>
+      <w:r>
+        <w:rPr>
+          <w:rFonts w:ascii="Courier New" w:hAnsi="Courier New"/>
+          <w:sz w:val="17"/>
+        </w:rPr>
+        <w:t xml:space="preserve">    while queue:</w:t>
+        <w:br/>
+      </w:r>
+      <w:r>
+        <w:rPr>
+          <w:rFonts w:ascii="Courier New" w:hAnsi="Courier New"/>
+          <w:sz w:val="17"/>
+        </w:rPr>
+        <w:t xml:space="preserve">        state, steps = queue.popleft()</w:t>
+        <w:br/>
+      </w:r>
+      <w:r>
+        <w:rPr>
+          <w:rFonts w:ascii="Courier New" w:hAnsi="Courier New"/>
+          <w:sz w:val="17"/>
+        </w:rPr>
+        <w:t xml:space="preserve">        if state[3]:</w:t>
+        <w:br/>
+      </w:r>
+      <w:r>
+        <w:rPr>
+          <w:rFonts w:ascii="Courier New" w:hAnsi="Courier New"/>
+          <w:sz w:val="17"/>
+        </w:rPr>
+        <w:t xml:space="preserve">            return steps</w:t>
+        <w:br/>
+      </w:r>
+      <w:r>
+        <w:rPr>
+          <w:rFonts w:ascii="Courier New" w:hAnsi="Courier New"/>
+          <w:sz w:val="17"/>
+        </w:rPr>
+        <w:t xml:space="preserve">        for action, new_state in next_states(state):</w:t>
+        <w:br/>
+      </w:r>
+      <w:r>
+        <w:rPr>
+          <w:rFonts w:ascii="Courier New" w:hAnsi="Courier New"/>
+          <w:sz w:val="17"/>
+        </w:rPr>
+        <w:t xml:space="preserve">            if new_state not in visited:</w:t>
+        <w:br/>
+      </w:r>
+      <w:r>
+        <w:rPr>
+          <w:rFonts w:ascii="Courier New" w:hAnsi="Courier New"/>
+          <w:sz w:val="17"/>
+        </w:rPr>
+        <w:t xml:space="preserve">                visited.add(new_state)</w:t>
+        <w:br/>
+      </w:r>
+      <w:r>
+        <w:rPr>
+          <w:rFonts w:ascii="Courier New" w:hAnsi="Courier New"/>
+          <w:sz w:val="17"/>
+        </w:rPr>
+        <w:t xml:space="preserve">                queue.append((new_state, steps + [(action, new_state)]))</w:t>
         <w:br/>
       </w:r>
       <w:r>
@@ -1283,95 +1190,63 @@
           <w:rFonts w:ascii="Courier New" w:hAnsi="Courier New"/>
           <w:sz w:val="17"/>
         </w:rPr>
-        <w:t>if __name__ == "__main__":</w:t>
-        <w:br/>
-      </w:r>
-      <w:r>
-        <w:rPr>
-          <w:rFonts w:ascii="Courier New" w:hAnsi="Courier New"/>
-          <w:sz w:val="17"/>
-        </w:rPr>
-        <w:t xml:space="preserve">    print("MONKEY BANANA PROBLEM")</w:t>
-        <w:br/>
-      </w:r>
-      <w:r>
-        <w:rPr>
-          <w:rFonts w:ascii="Courier New" w:hAnsi="Courier New"/>
-          <w:sz w:val="17"/>
-        </w:rPr>
-        <w:t xml:space="preserve">    print("Initial state (monkey, on_box, box, has_banana):", START)</w:t>
-        <w:br/>
-      </w:r>
-      <w:r>
-        <w:rPr>
-          <w:rFonts w:ascii="Courier New" w:hAnsi="Courier New"/>
-          <w:sz w:val="17"/>
-        </w:rPr>
-        <w:t xml:space="preserve">    print("Goal: monkey has the banana (hanging at the middle)\n")</w:t>
-        <w:br/>
-      </w:r>
-      <w:r>
-        <w:rPr>
-          <w:rFonts w:ascii="Courier New" w:hAnsi="Courier New"/>
-          <w:sz w:val="17"/>
-        </w:rPr>
-        <w:t xml:space="preserve">    plan = solve()</w:t>
-        <w:br/>
-      </w:r>
-      <w:r>
-        <w:rPr>
-          <w:rFonts w:ascii="Courier New" w:hAnsi="Courier New"/>
-          <w:sz w:val="17"/>
-        </w:rPr>
-        <w:t xml:space="preserve">    if plan is None:</w:t>
-        <w:br/>
-      </w:r>
-      <w:r>
-        <w:rPr>
-          <w:rFonts w:ascii="Courier New" w:hAnsi="Courier New"/>
-          <w:sz w:val="17"/>
-        </w:rPr>
-        <w:t xml:space="preserve">        print("No solution found")</w:t>
-        <w:br/>
-      </w:r>
-      <w:r>
-        <w:rPr>
-          <w:rFonts w:ascii="Courier New" w:hAnsi="Courier New"/>
-          <w:sz w:val="17"/>
-        </w:rPr>
-        <w:t xml:space="preserve">    else:</w:t>
-        <w:br/>
-      </w:r>
-      <w:r>
-        <w:rPr>
-          <w:rFonts w:ascii="Courier New" w:hAnsi="Courier New"/>
-          <w:sz w:val="17"/>
-        </w:rPr>
-        <w:t xml:space="preserve">        print(f"Solution found in {len(plan)} steps:\n")</w:t>
-        <w:br/>
-      </w:r>
-      <w:r>
-        <w:rPr>
-          <w:rFonts w:ascii="Courier New" w:hAnsi="Courier New"/>
-          <w:sz w:val="17"/>
-        </w:rPr>
-        <w:t xml:space="preserve">        for i, (act, st) in enumerate(plan, 1):</w:t>
-        <w:br/>
-      </w:r>
-      <w:r>
-        <w:rPr>
-          <w:rFonts w:ascii="Courier New" w:hAnsi="Courier New"/>
-          <w:sz w:val="17"/>
-        </w:rPr>
-        <w:t xml:space="preserve">            print(f"Step {i}: {act:28s} -&gt; state {st}")</w:t>
-        <w:br/>
-      </w:r>
-      <w:r>
-        <w:rPr>
-          <w:rFonts w:ascii="Courier New" w:hAnsi="Courier New"/>
-          <w:sz w:val="17"/>
-        </w:rPr>
-        <w:t xml:space="preserve">        print("\nThe monkey has got the banana!")</w:t>
+        <w:t>plan = solve()</w:t>
+        <w:br/>
+      </w:r>
+      <w:r>
+        <w:rPr>
+          <w:rFonts w:ascii="Courier New" w:hAnsi="Courier New"/>
+          <w:sz w:val="17"/>
+        </w:rPr>
+        <w:t>if plan is None:</w:t>
+        <w:br/>
+      </w:r>
+      <w:r>
+        <w:rPr>
+          <w:rFonts w:ascii="Courier New" w:hAnsi="Courier New"/>
+          <w:sz w:val="17"/>
+        </w:rPr>
+        <w:t xml:space="preserve">    print("No solution")</w:t>
+        <w:br/>
+      </w:r>
+      <w:r>
+        <w:rPr>
+          <w:rFonts w:ascii="Courier New" w:hAnsi="Courier New"/>
+          <w:sz w:val="17"/>
+        </w:rPr>
+        <w:t>else:</w:t>
+        <w:br/>
+      </w:r>
+      <w:r>
+        <w:rPr>
+          <w:rFonts w:ascii="Courier New" w:hAnsi="Courier New"/>
+          <w:sz w:val="17"/>
+        </w:rPr>
+        <w:t xml:space="preserve">    print("Start state:", start)</w:t>
+        <w:br/>
+      </w:r>
+      <w:r>
+        <w:rPr>
+          <w:rFonts w:ascii="Courier New" w:hAnsi="Courier New"/>
+          <w:sz w:val="17"/>
+        </w:rPr>
+        <w:t xml:space="preserve">    for i, (action, state) in enumerate(plan, 1):</w:t>
+        <w:br/>
+      </w:r>
+      <w:r>
+        <w:rPr>
+          <w:rFonts w:ascii="Courier New" w:hAnsi="Courier New"/>
+          <w:sz w:val="17"/>
+        </w:rPr>
+        <w:t xml:space="preserve">        print(i, action, state)</w:t>
+        <w:br/>
+      </w:r>
+      <w:r>
+        <w:rPr>
+          <w:rFonts w:ascii="Courier New" w:hAnsi="Courier New"/>
+          <w:sz w:val="17"/>
+        </w:rPr>
+        <w:t xml:space="preserve">    print("Monkey got the banana in", len(plan), "steps")</w:t>
       </w:r>
     </w:p>
     <w:p>
@@ -1405,7 +1280,7 @@
           <w:b w:val="0"/>
           <w:sz w:val="17"/>
         </w:rPr>
-        <w:t>MONKEY BANANA PROBLEM</w:t>
+        <w:t>Start state: ('door', False, 'window', False)</w:t>
         <w:br/>
       </w:r>
       <w:r>
@@ -1414,7 +1289,7 @@
           <w:b w:val="0"/>
           <w:sz w:val="17"/>
         </w:rPr>
-        <w:t>Initial state (monkey, on_box, box, has_banana): ('door', False, 'window', False)</w:t>
+        <w:t>1 Walk to window ('window', False, 'window', False)</w:t>
         <w:br/>
       </w:r>
       <w:r>
@@ -1423,7 +1298,7 @@
           <w:b w:val="0"/>
           <w:sz w:val="17"/>
         </w:rPr>
-        <w:t>Goal: monkey has the banana (hanging at the middle)</w:t>
+        <w:t>2 Push box to middle ('middle', False, 'middle', False)</w:t>
         <w:br/>
       </w:r>
       <w:r>
@@ -1432,6 +1307,7 @@
           <w:b w:val="0"/>
           <w:sz w:val="17"/>
         </w:rPr>
+        <w:t>3 Climb on box ('middle', True, 'middle', False)</w:t>
         <w:br/>
       </w:r>
       <w:r>
@@ -1440,7 +1316,7 @@
           <w:b w:val="0"/>
           <w:sz w:val="17"/>
         </w:rPr>
-        <w:t>Solution found in 4 steps:</w:t>
+        <w:t>4 Grab banana ('middle', True, 'middle', True)</w:t>
         <w:br/>
       </w:r>
       <w:r>
@@ -1449,59 +1325,7 @@
           <w:b w:val="0"/>
           <w:sz w:val="17"/>
         </w:rPr>
-        <w:br/>
-      </w:r>
-      <w:r>
-        <w:rPr>
-          <w:rFonts w:ascii="Courier New" w:hAnsi="Courier New"/>
-          <w:b w:val="0"/>
-          <w:sz w:val="17"/>
-        </w:rPr>
-        <w:t>Step 1: Walk from door to window     -&gt; state ('window', False, 'window', False)</w:t>
-        <w:br/>
-      </w:r>
-      <w:r>
-        <w:rPr>
-          <w:rFonts w:ascii="Courier New" w:hAnsi="Courier New"/>
-          <w:b w:val="0"/>
-          <w:sz w:val="17"/>
-        </w:rPr>
-        <w:t>Step 2: Push box from window to middle -&gt; state ('middle', False, 'middle', False)</w:t>
-        <w:br/>
-      </w:r>
-      <w:r>
-        <w:rPr>
-          <w:rFonts w:ascii="Courier New" w:hAnsi="Courier New"/>
-          <w:b w:val="0"/>
-          <w:sz w:val="17"/>
-        </w:rPr>
-        <w:t>Step 3: Climb onto the box           -&gt; state ('middle', True, 'middle', False)</w:t>
-        <w:br/>
-      </w:r>
-      <w:r>
-        <w:rPr>
-          <w:rFonts w:ascii="Courier New" w:hAnsi="Courier New"/>
-          <w:b w:val="0"/>
-          <w:sz w:val="17"/>
-        </w:rPr>
-        <w:t>Step 4: Grasp the banana             -&gt; state ('middle', True, 'middle', True)</w:t>
-        <w:br/>
-      </w:r>
-      <w:r>
-        <w:rPr>
-          <w:rFonts w:ascii="Courier New" w:hAnsi="Courier New"/>
-          <w:b w:val="0"/>
-          <w:sz w:val="17"/>
-        </w:rPr>
-        <w:br/>
-      </w:r>
-      <w:r>
-        <w:rPr>
-          <w:rFonts w:ascii="Courier New" w:hAnsi="Courier New"/>
-          <w:b w:val="0"/>
-          <w:sz w:val="17"/>
-        </w:rPr>
-        <w:t>The monkey has got the banana!</w:t>
+        <w:t>Monkey got the banana in 4 steps</w:t>
       </w:r>
     </w:p>
     <w:p xmlns:wp14="http://schemas.microsoft.com/office/word/2010/wordml" wp14:textId="77777777">

</xml_diff>

<commit_message>
Add code and output screenshots to experiment file
Co-Authored-By: Claude Sonnet 5.5 <noreply@anthropic.com>
Claude-Session: https://claude.ai/code/session_019xe3RvJLr44vVSxyK66BKy
</commit_message>
<xml_diff>
--- a/AI_Experiment_10_Monkey_Banana_Krishang_B106.docx
+++ b/AI_Experiment_10_Monkey_Banana_Krishang_B106.docx
@@ -1262,7 +1262,7 @@
         <w:rPr>
           <w:b/>
         </w:rPr>
-        <w:t>Output:</w:t>
+        <w:t>Code screenshot:</w:t>
       </w:r>
     </w:p>
     <w:p>
@@ -1276,6 +1276,71 @@
       </w:pPr>
       <w:r>
         <w:rPr>
+          <w:b w:val="0"/>
+        </w:rPr>
+      </w:r>
+      <w:r>
+        <w:drawing>
+          <wp:inline xmlns:a="http://schemas.openxmlformats.org/drawingml/2006/main" xmlns:pic="http://schemas.openxmlformats.org/drawingml/2006/picture">
+            <wp:extent cx="5029200" cy="4458661"/>
+            <wp:docPr id="1" name="Picture 1"/>
+            <wp:cNvGraphicFramePr>
+              <a:graphicFrameLocks noChangeAspect="1"/>
+            </wp:cNvGraphicFramePr>
+            <a:graphic>
+              <a:graphicData uri="http://schemas.openxmlformats.org/drawingml/2006/picture">
+                <pic:pic>
+                  <pic:nvPicPr>
+                    <pic:cNvPr id="0" name="2.png"/>
+                    <pic:cNvPicPr/>
+                  </pic:nvPicPr>
+                  <pic:blipFill>
+                    <a:blip r:embed="rId12"/>
+                    <a:stretch>
+                      <a:fillRect/>
+                    </a:stretch>
+                  </pic:blipFill>
+                  <pic:spPr>
+                    <a:xfrm>
+                      <a:off x="0" y="0"/>
+                      <a:ext cx="5029200" cy="4458661"/>
+                    </a:xfrm>
+                    <a:prstGeom prst="rect"/>
+                  </pic:spPr>
+                </pic:pic>
+              </a:graphicData>
+            </a:graphic>
+          </wp:inline>
+        </w:drawing>
+      </w:r>
+    </w:p>
+    <w:p>
+      <w:pPr>
+        <w:rPr>
+          <w:b/>
+          <w:i/>
+          <w:sz w:val="20"/>
+          <w:szCs w:val="20"/>
+        </w:rPr>
+      </w:pPr>
+      <w:r>
+        <w:rPr>
+          <w:b/>
+        </w:rPr>
+        <w:t>Output:</w:t>
+      </w:r>
+    </w:p>
+    <w:p>
+      <w:pPr>
+        <w:rPr>
+          <w:b/>
+          <w:i/>
+          <w:sz w:val="20"/>
+          <w:szCs w:val="20"/>
+        </w:rPr>
+      </w:pPr>
+      <w:r>
+        <w:rPr>
           <w:rFonts w:ascii="Courier New" w:hAnsi="Courier New"/>
           <w:b w:val="0"/>
           <w:sz w:val="17"/>
@@ -1326,6 +1391,71 @@
           <w:sz w:val="17"/>
         </w:rPr>
         <w:t>Monkey got the banana in 4 steps</w:t>
+      </w:r>
+    </w:p>
+    <w:p>
+      <w:pPr>
+        <w:rPr>
+          <w:b/>
+          <w:i/>
+          <w:sz w:val="20"/>
+          <w:szCs w:val="20"/>
+        </w:rPr>
+      </w:pPr>
+      <w:r>
+        <w:rPr>
+          <w:b/>
+        </w:rPr>
+        <w:t>Output screenshot:</w:t>
+      </w:r>
+    </w:p>
+    <w:p>
+      <w:pPr>
+        <w:rPr>
+          <w:b/>
+          <w:i/>
+          <w:sz w:val="20"/>
+          <w:szCs w:val="20"/>
+        </w:rPr>
+      </w:pPr>
+      <w:r>
+        <w:rPr>
+          <w:b w:val="0"/>
+        </w:rPr>
+      </w:r>
+      <w:r>
+        <w:drawing>
+          <wp:inline xmlns:a="http://schemas.openxmlformats.org/drawingml/2006/main" xmlns:pic="http://schemas.openxmlformats.org/drawingml/2006/picture">
+            <wp:extent cx="5029200" cy="4674683"/>
+            <wp:docPr id="2" name="Picture 2"/>
+            <wp:cNvGraphicFramePr>
+              <a:graphicFrameLocks noChangeAspect="1"/>
+            </wp:cNvGraphicFramePr>
+            <a:graphic>
+              <a:graphicData uri="http://schemas.openxmlformats.org/drawingml/2006/picture">
+                <pic:pic>
+                  <pic:nvPicPr>
+                    <pic:cNvPr id="0" name="1.png"/>
+                    <pic:cNvPicPr/>
+                  </pic:nvPicPr>
+                  <pic:blipFill>
+                    <a:blip r:embed="rId13"/>
+                    <a:stretch>
+                      <a:fillRect/>
+                    </a:stretch>
+                  </pic:blipFill>
+                  <pic:spPr>
+                    <a:xfrm>
+                      <a:off x="0" y="0"/>
+                      <a:ext cx="5029200" cy="4674683"/>
+                    </a:xfrm>
+                    <a:prstGeom prst="rect"/>
+                  </pic:spPr>
+                </pic:pic>
+              </a:graphicData>
+            </a:graphic>
+          </wp:inline>
+        </w:drawing>
       </w:r>
     </w:p>
     <w:p xmlns:wp14="http://schemas.microsoft.com/office/word/2010/wordml" wp14:textId="77777777">

</xml_diff>